<commit_message>
feat(server): scaffold FastAPI backend theo 15 BR, 21 UC, RBAC, Audit Log
- Models/Schemas theo Data Dictionary (6 bảng: USERS, WORKSHOPS, REGISTRATIONS, ATTENDANCE, SURVEYS, AUDIT_LOGS)
- Services: Workshop (BR-06/07/12/13), Registration & Waitlist FIFO (BR-01/02/03/08/11/15), Check-in QR (BR-04/05/14), Survey/KPI (BR-09)
- 21 endpoint REST theo UC-01 -> UC-21, JWT Auth + RBAC middleware + ownership check (organizer_id)
- Audit Log tách action theo actor (CANCEL_BY_ORGANIZER vs FORCE_CANCEL_BY_ADMIN)
- Seed data + script khoi tao DB

KNOWN ISSUE (chua fix, xem Issue #<so-issue>):
- Chua co row-locking (with_for_update) o BR-02 (dang ky) va BR-14 (check-in)
- Rui ro race condition khi nhieu request dong thoi tranh 1 slot cuoi
- Chua co test concurrency trong test_backend.py
</commit_message>
<xml_diff>
--- a/DOCX/Ver01_Bộ Tài Liệu Tổng Hợp-TTTN_MIS_04.docx
+++ b/DOCX/Ver01_Bộ Tài Liệu Tổng Hợp-TTTN_MIS_04.docx
@@ -37,40 +37,7 @@
           <w:sz w:val="24"/>
           <w:szCs w:val="24"/>
         </w:rPr>
-        <w:t>Đề tài TTTN_MIS_04</w:t>
-      </w:r>
-      <w:r>
-        <w:rPr>
-          <w:rFonts w:eastAsia="Times New Roman" w:cs="Times New Roman"/>
-          <w:bCs/>
-          <w:i/>
-          <w:color w:val="000000"/>
-          <w:sz w:val="24"/>
-          <w:szCs w:val="24"/>
-        </w:rPr>
-        <w:t xml:space="preserve"> </w:t>
-      </w:r>
-      <w:r>
-        <w:rPr>
-          <w:rFonts w:eastAsia="Times New Roman" w:cs="Times New Roman"/>
-          <w:bCs/>
-          <w:i/>
-          <w:color w:val="000000"/>
-          <w:sz w:val="24"/>
-          <w:szCs w:val="24"/>
-        </w:rPr>
-        <w:t xml:space="preserve">— </w:t>
-      </w:r>
-      <w:r>
-        <w:rPr>
-          <w:rFonts w:eastAsia="Times New Roman" w:cs="Times New Roman"/>
-          <w:bCs/>
-          <w:i/>
-          <w:color w:val="000000"/>
-          <w:sz w:val="24"/>
-          <w:szCs w:val="24"/>
-        </w:rPr>
-        <w:t>Tổng hợp (Ver_01)</w:t>
+        <w:t>Đề tài TTTN_MIS_04 — Tổng hợp (Ver_01)</w:t>
       </w:r>
     </w:p>
     <w:p>
@@ -236,8 +203,6 @@
       <w:r>
         <w:br w:type="page"/>
       </w:r>
-      <w:bookmarkStart w:id="0" w:name="_GoBack"/>
-      <w:bookmarkEnd w:id="0"/>
     </w:p>
     <w:p>
       <w:pPr>
@@ -3739,12 +3704,12 @@
       </w:tblPr>
       <w:tblGrid>
         <w:gridCol w:w="692"/>
-        <w:gridCol w:w="908"/>
-        <w:gridCol w:w="1371"/>
+        <w:gridCol w:w="905"/>
+        <w:gridCol w:w="1417"/>
         <w:gridCol w:w="1135"/>
-        <w:gridCol w:w="2191"/>
-        <w:gridCol w:w="1599"/>
-        <w:gridCol w:w="1454"/>
+        <w:gridCol w:w="2182"/>
+        <w:gridCol w:w="1582"/>
+        <w:gridCol w:w="1437"/>
       </w:tblGrid>
       <w:tr>
         <w:trPr>
@@ -5543,7 +5508,13 @@
           </w:tcPr>
           <w:p>
             <w:r>
-              <w:t>Tương ứng BR-01, BR-02.</w:t>
+              <w:t>Tương ứng BR-01, BR-02</w:t>
+            </w:r>
+            <w:r>
+              <w:rPr>
+                <w:highlight w:val="yellow"/>
+              </w:rPr>
+              <w:t>, BR-15.</w:t>
             </w:r>
           </w:p>
         </w:tc>
@@ -5789,7 +5760,13 @@
           </w:tcPr>
           <w:p>
             <w:r>
-              <w:t>(Nhánh Hết chỗ) Thông báo hết chỗ, đề nghị tham gia Danh sách chờ</w:t>
+              <w:t>(Nhánh Hết chỗ</w:t>
+            </w:r>
+            <w:r>
+              <w:t xml:space="preserve"> / ngoài thời gian</w:t>
+            </w:r>
+            <w:r>
+              <w:t>) Thông báo hết chỗ, đề nghị tham gia Danh sách chờ</w:t>
             </w:r>
           </w:p>
         </w:tc>
@@ -5885,7 +5862,13 @@
           </w:tcPr>
           <w:p>
             <w:r>
-              <w:t>Tương ứng BR-02.</w:t>
+              <w:t>Tương ứng BR-02</w:t>
+            </w:r>
+            <w:r>
+              <w:rPr>
+                <w:highlight w:val="yellow"/>
+              </w:rPr>
+              <w:t>, BR-15.</w:t>
             </w:r>
           </w:p>
         </w:tc>
@@ -7472,7 +7455,6 @@
           </w:tcPr>
           <w:p>
             <w:r>
-              <w:lastRenderedPageBreak/>
               <w:t>14</w:t>
             </w:r>
           </w:p>
@@ -7642,6 +7624,7 @@
           </w:tcPr>
           <w:p>
             <w:r>
+              <w:lastRenderedPageBreak/>
               <w:t>15</w:t>
             </w:r>
           </w:p>
@@ -8052,18 +8035,15 @@
         <w:t>Giai đoạn 6 — Người tham gia đăng ký trực tuyến</w:t>
       </w:r>
       <w:r>
-        <w:t xml:space="preserve">: Người tham gia lựa chọn sự kiện đã được công bố và thực hiện đăng ký bằng địa chỉ email của mình. Mỗi lượt đăng ký tương ứng đúng một vé (một người tham gia); hệ thống không hỗ trợ đăng ký nhiều vé hoặc đăng </w:t>
-      </w:r>
-      <w:r>
+        <w:t>: Người tham gia lựa chọn sự kiện đã được công bố và thực hiện đăng ký bằng địa chỉ email của mình. Mỗi lượt đăng ký tương ứng đúng một vé (một người tham gia); hệ thống không hỗ trợ đăng ký nhiều vé hoặc đăng ký hộ người khác trong một lượt. Hệ thống tiếp nhận yêu cầu và kiểm tra các điều kiện đăng ký.</w:t>
+      </w:r>
+    </w:p>
+    <w:p>
+      <w:r>
+        <w:rPr>
+          <w:b/>
+        </w:rPr>
         <w:lastRenderedPageBreak/>
-        <w:t>ký hộ người khác trong một lượt. Hệ thống tiếp nhận yêu cầu và kiểm tra các điều kiện đăng ký.</w:t>
-      </w:r>
-    </w:p>
-    <w:p>
-      <w:r>
-        <w:rPr>
-          <w:b/>
-        </w:rPr>
         <w:t>Giai đoạn 7 — Hệ thống tự động kiểm tra và rẽ nhánh</w:t>
       </w:r>
       <w:r>
@@ -9843,12 +9823,12 @@
         <w:tblLook w:val="04A0" w:firstRow="1" w:lastRow="0" w:firstColumn="1" w:lastColumn="0" w:noHBand="0" w:noVBand="1"/>
       </w:tblPr>
       <w:tblGrid>
-        <w:gridCol w:w="662"/>
-        <w:gridCol w:w="1087"/>
-        <w:gridCol w:w="1370"/>
-        <w:gridCol w:w="2051"/>
-        <w:gridCol w:w="2724"/>
-        <w:gridCol w:w="1456"/>
+        <w:gridCol w:w="655"/>
+        <w:gridCol w:w="989"/>
+        <w:gridCol w:w="1171"/>
+        <w:gridCol w:w="2733"/>
+        <w:gridCol w:w="2388"/>
+        <w:gridCol w:w="1414"/>
       </w:tblGrid>
       <w:tr>
         <w:trPr>
@@ -10602,6 +10582,233 @@
           <w:p>
             <w:r>
               <w:t>Người tham gia, Đăng ký, Điểm danh, Sự kiện</w:t>
+            </w:r>
+          </w:p>
+        </w:tc>
+      </w:tr>
+      <w:tr>
+        <w:trPr>
+          <w:trHeight w:val="2120"/>
+        </w:trPr>
+        <w:tc>
+          <w:tcPr>
+            <w:tcW w:w="0" w:type="auto"/>
+            <w:tcBorders>
+              <w:top w:val="single" w:sz="4" w:space="0" w:color="000000"/>
+              <w:left w:val="single" w:sz="4" w:space="0" w:color="000000"/>
+              <w:bottom w:val="single" w:sz="4" w:space="0" w:color="000000"/>
+              <w:right w:val="single" w:sz="4" w:space="0" w:color="000000"/>
+            </w:tcBorders>
+            <w:tcMar>
+              <w:top w:w="100" w:type="dxa"/>
+              <w:left w:w="100" w:type="dxa"/>
+              <w:bottom w:w="100" w:type="dxa"/>
+              <w:right w:w="100" w:type="dxa"/>
+            </w:tcMar>
+          </w:tcPr>
+          <w:p>
+            <w:pPr>
+              <w:rPr>
+                <w:b/>
+                <w:highlight w:val="yellow"/>
+              </w:rPr>
+            </w:pPr>
+            <w:r>
+              <w:rPr>
+                <w:b/>
+                <w:highlight w:val="yellow"/>
+              </w:rPr>
+              <w:lastRenderedPageBreak/>
+              <w:t>BR-15</w:t>
+            </w:r>
+          </w:p>
+        </w:tc>
+        <w:tc>
+          <w:tcPr>
+            <w:tcW w:w="0" w:type="auto"/>
+            <w:tcBorders>
+              <w:top w:val="single" w:sz="4" w:space="0" w:color="000000"/>
+              <w:left w:val="single" w:sz="4" w:space="0" w:color="000000"/>
+              <w:bottom w:val="single" w:sz="4" w:space="0" w:color="000000"/>
+              <w:right w:val="single" w:sz="4" w:space="0" w:color="000000"/>
+            </w:tcBorders>
+            <w:tcMar>
+              <w:top w:w="100" w:type="dxa"/>
+              <w:left w:w="100" w:type="dxa"/>
+              <w:bottom w:w="100" w:type="dxa"/>
+              <w:right w:w="100" w:type="dxa"/>
+            </w:tcMar>
+          </w:tcPr>
+          <w:p>
+            <w:pPr>
+              <w:rPr>
+                <w:highlight w:val="yellow"/>
+              </w:rPr>
+            </w:pPr>
+            <w:r>
+              <w:rPr>
+                <w:highlight w:val="yellow"/>
+              </w:rPr>
+              <w:t>Giới hạn thời gian đăng ký</w:t>
+            </w:r>
+          </w:p>
+        </w:tc>
+        <w:tc>
+          <w:tcPr>
+            <w:tcW w:w="0" w:type="auto"/>
+            <w:tcBorders>
+              <w:top w:val="single" w:sz="4" w:space="0" w:color="000000"/>
+              <w:left w:val="single" w:sz="4" w:space="0" w:color="000000"/>
+              <w:bottom w:val="single" w:sz="4" w:space="0" w:color="000000"/>
+              <w:right w:val="single" w:sz="4" w:space="0" w:color="000000"/>
+            </w:tcBorders>
+            <w:tcMar>
+              <w:top w:w="100" w:type="dxa"/>
+              <w:left w:w="100" w:type="dxa"/>
+              <w:bottom w:w="100" w:type="dxa"/>
+              <w:right w:w="100" w:type="dxa"/>
+            </w:tcMar>
+          </w:tcPr>
+          <w:p>
+            <w:pPr>
+              <w:rPr>
+                <w:highlight w:val="yellow"/>
+              </w:rPr>
+            </w:pPr>
+            <w:r>
+              <w:rPr>
+                <w:highlight w:val="yellow"/>
+              </w:rPr>
+              <w:t>Hệ thống chỉ chấp nhận đăng ký trong khoảng thời gian nhất định</w:t>
+            </w:r>
+          </w:p>
+        </w:tc>
+        <w:tc>
+          <w:tcPr>
+            <w:tcW w:w="0" w:type="auto"/>
+            <w:tcBorders>
+              <w:top w:val="single" w:sz="4" w:space="0" w:color="000000"/>
+              <w:left w:val="single" w:sz="4" w:space="0" w:color="000000"/>
+              <w:bottom w:val="single" w:sz="4" w:space="0" w:color="000000"/>
+              <w:right w:val="single" w:sz="4" w:space="0" w:color="000000"/>
+            </w:tcBorders>
+            <w:tcMar>
+              <w:top w:w="100" w:type="dxa"/>
+              <w:left w:w="100" w:type="dxa"/>
+              <w:bottom w:w="100" w:type="dxa"/>
+              <w:right w:w="100" w:type="dxa"/>
+            </w:tcMar>
+          </w:tcPr>
+          <w:p>
+            <w:pPr>
+              <w:rPr>
+                <w:highlight w:val="yellow"/>
+              </w:rPr>
+            </w:pPr>
+            <w:r>
+              <w:rPr>
+                <w:highlight w:val="yellow"/>
+              </w:rPr>
+              <w:t>Sự kiện đã công bố</w:t>
+            </w:r>
+          </w:p>
+          <w:p>
+            <w:pPr>
+              <w:rPr>
+                <w:highlight w:val="yellow"/>
+              </w:rPr>
+            </w:pPr>
+            <w:r>
+              <w:rPr>
+                <w:highlight w:val="yellow"/>
+              </w:rPr>
+              <w:t>Nếu Organizer có thiết lập registration_close_at</w:t>
+            </w:r>
+          </w:p>
+          <w:p>
+            <w:pPr>
+              <w:rPr>
+                <w:highlight w:val="yellow"/>
+              </w:rPr>
+            </w:pPr>
+            <w:r>
+              <w:rPr>
+                <w:highlight w:val="yellow"/>
+              </w:rPr>
+              <w:t>Nếu không thiết lập registration_close_at: áp dụng quy tắc BR-08.</w:t>
+            </w:r>
+          </w:p>
+        </w:tc>
+        <w:tc>
+          <w:tcPr>
+            <w:tcW w:w="0" w:type="auto"/>
+            <w:tcBorders>
+              <w:top w:val="single" w:sz="4" w:space="0" w:color="000000"/>
+              <w:left w:val="single" w:sz="4" w:space="0" w:color="000000"/>
+              <w:bottom w:val="single" w:sz="4" w:space="0" w:color="000000"/>
+              <w:right w:val="single" w:sz="4" w:space="0" w:color="000000"/>
+            </w:tcBorders>
+            <w:tcMar>
+              <w:top w:w="100" w:type="dxa"/>
+              <w:left w:w="100" w:type="dxa"/>
+              <w:bottom w:w="100" w:type="dxa"/>
+              <w:right w:w="100" w:type="dxa"/>
+            </w:tcMar>
+          </w:tcPr>
+          <w:p>
+            <w:pPr>
+              <w:rPr>
+                <w:highlight w:val="yellow"/>
+              </w:rPr>
+            </w:pPr>
+            <w:r>
+              <w:rPr>
+                <w:highlight w:val="yellow"/>
+              </w:rPr>
+              <w:t xml:space="preserve">Nếu trong khoảng thời gian: cho phép đăng ký. </w:t>
+            </w:r>
+          </w:p>
+          <w:p>
+            <w:pPr>
+              <w:rPr>
+                <w:highlight w:val="yellow"/>
+              </w:rPr>
+            </w:pPr>
+            <w:r>
+              <w:rPr>
+                <w:highlight w:val="yellow"/>
+              </w:rPr>
+              <w:t>Nếu ngoài khoảng thời gian: từ chối, báo "đã đóng đăng ký".</w:t>
+            </w:r>
+          </w:p>
+        </w:tc>
+        <w:tc>
+          <w:tcPr>
+            <w:tcW w:w="0" w:type="auto"/>
+            <w:tcBorders>
+              <w:top w:val="single" w:sz="4" w:space="0" w:color="000000"/>
+              <w:left w:val="single" w:sz="4" w:space="0" w:color="000000"/>
+              <w:bottom w:val="single" w:sz="4" w:space="0" w:color="000000"/>
+              <w:right w:val="single" w:sz="4" w:space="0" w:color="000000"/>
+            </w:tcBorders>
+            <w:tcMar>
+              <w:top w:w="100" w:type="dxa"/>
+              <w:left w:w="100" w:type="dxa"/>
+              <w:bottom w:w="100" w:type="dxa"/>
+              <w:right w:w="100" w:type="dxa"/>
+            </w:tcMar>
+          </w:tcPr>
+          <w:p>
+            <w:pPr>
+              <w:rPr>
+                <w:highlight w:val="yellow"/>
+              </w:rPr>
+            </w:pPr>
+            <w:r>
+              <w:rPr>
+                <w:highlight w:val="yellow"/>
+              </w:rPr>
+              <w:t>Organizer, Participant</w:t>
             </w:r>
           </w:p>
         </w:tc>
@@ -10915,8 +11122,8 @@
       </w:tblPr>
       <w:tblGrid>
         <w:gridCol w:w="692"/>
-        <w:gridCol w:w="2243"/>
-        <w:gridCol w:w="6415"/>
+        <w:gridCol w:w="2355"/>
+        <w:gridCol w:w="6303"/>
       </w:tblGrid>
       <w:tr>
         <w:trPr>
@@ -12010,7 +12217,13 @@
           </w:tcPr>
           <w:p>
             <w:r>
-              <w:t>Cho phép Người tham gia theo dõi trạng thái đăng ký của mình như đã đăng ký, đang chờ hoặc đã hủy.</w:t>
+              <w:t xml:space="preserve">Cho phép Người tham gia theo dõi trạng thái đăng ký của mình như đã </w:t>
+            </w:r>
+            <w:r>
+              <w:t xml:space="preserve">xác nhận </w:t>
+            </w:r>
+            <w:r>
+              <w:t>đăng ký, đang chờ hoặc đã hủy.</w:t>
             </w:r>
           </w:p>
         </w:tc>
@@ -12280,7 +12493,12 @@
           </w:tcPr>
           <w:p>
             <w:r>
-              <w:t>Cho phép Quản trị viên (Admin) tạo mới tài khoản nội bộ (Organizer / Admin) hoặc thay đổi vai trò (Role) của người dùng trong hệ thống và tự động ghi vết Audit Log.  </w:t>
+              <w:t xml:space="preserve">Cho phép Quản trị viên (Admin) tạo mới tài khoản nội bộ hoặc thay đổi vai trò (Role) của người dùng trong hệ thống và tự động ghi </w:t>
+            </w:r>
+            <w:bookmarkStart w:id="0" w:name="_GoBack"/>
+            <w:bookmarkEnd w:id="0"/>
+            <w:r>
+              <w:t>vết Audit Log.  </w:t>
             </w:r>
           </w:p>
         </w:tc>
@@ -13330,7 +13548,6 @@
           <w:color w:val="000000"/>
           <w:szCs w:val="26"/>
         </w:rPr>
-        <w:lastRenderedPageBreak/>
         <w:t>1.3. Yêu cầu đặc biệt</w:t>
       </w:r>
     </w:p>
@@ -13355,6 +13572,7 @@
           <w:color w:val="000000"/>
           <w:szCs w:val="26"/>
         </w:rPr>
+        <w:lastRenderedPageBreak/>
         <w:t>Hệ thống phải xác thực Người dùng trước khi cho phép truy cập.</w:t>
       </w:r>
     </w:p>
@@ -13929,7 +14147,6 @@
           <w:color w:val="000000"/>
           <w:szCs w:val="26"/>
         </w:rPr>
-        <w:lastRenderedPageBreak/>
         <w:t>Hệ thống kết thúc phiên đăng nhập.</w:t>
       </w:r>
     </w:p>
@@ -13954,6 +14171,7 @@
           <w:color w:val="000000"/>
           <w:szCs w:val="26"/>
         </w:rPr>
+        <w:lastRenderedPageBreak/>
         <w:t>Hệ thống chuyển Người dùng về màn hình đăng nhập.</w:t>
       </w:r>
     </w:p>
@@ -19689,7 +19907,7 @@
           <w:ilvl w:val="0"/>
           <w:numId w:val="48"/>
         </w:numPr>
-        <w:spacing w:after="240" w:line="240" w:lineRule="auto"/>
+        <w:spacing w:after="0" w:line="240" w:lineRule="auto"/>
         <w:jc w:val="left"/>
         <w:textAlignment w:val="baseline"/>
         <w:rPr>
@@ -19707,6 +19925,34 @@
         <w:t>Nếu xảy ra lỗi trong quá trình đăng ký, hệ thống không tạo lượt đăng ký và thông báo đăng ký không thành công.</w:t>
       </w:r>
     </w:p>
+    <w:p>
+      <w:pPr>
+        <w:numPr>
+          <w:ilvl w:val="0"/>
+          <w:numId w:val="48"/>
+        </w:numPr>
+        <w:spacing w:after="0" w:line="240" w:lineRule="auto"/>
+        <w:jc w:val="left"/>
+        <w:textAlignment w:val="baseline"/>
+        <w:rPr>
+          <w:rFonts w:eastAsia="Times New Roman" w:cs="Times New Roman"/>
+          <w:color w:val="000000"/>
+          <w:szCs w:val="26"/>
+          <w:highlight w:val="yellow"/>
+        </w:rPr>
+      </w:pPr>
+      <w:bookmarkStart w:id="1" w:name="_Hlk238204243"/>
+      <w:r>
+        <w:rPr>
+          <w:rFonts w:eastAsia="Times New Roman" w:cs="Times New Roman"/>
+          <w:color w:val="000000"/>
+          <w:szCs w:val="26"/>
+          <w:highlight w:val="yellow"/>
+        </w:rPr>
+        <w:t>Nếu ngoài khung giờ đăng ký (BR-15), hệ thống từ chối và thông báo.</w:t>
+      </w:r>
+    </w:p>
+    <w:bookmarkEnd w:id="1"/>
     <w:p>
       <w:pPr>
         <w:spacing w:before="360" w:after="80" w:line="240" w:lineRule="auto"/>
@@ -20180,6 +20426,7 @@
           <w:color w:val="000000"/>
           <w:szCs w:val="26"/>
         </w:rPr>
+        <w:lastRenderedPageBreak/>
         <w:t>Use Case: Hủy đăng ký Workshop:</w:t>
       </w:r>
       <w:r>
@@ -20214,7 +20461,6 @@
           <w:color w:val="000000"/>
           <w:szCs w:val="26"/>
         </w:rPr>
-        <w:lastRenderedPageBreak/>
         <w:t>Use Case: Điểm danh bằng mã QR:</w:t>
       </w:r>
       <w:r>
@@ -20856,6 +21102,7 @@
           <w:color w:val="000000"/>
           <w:szCs w:val="26"/>
         </w:rPr>
+        <w:lastRenderedPageBreak/>
         <w:t>Nếu xảy ra lỗi, hệ thống không hoàn tất việc hủy đăng ký.</w:t>
       </w:r>
     </w:p>
@@ -20880,7 +21127,6 @@
           <w:color w:val="000000"/>
           <w:szCs w:val="26"/>
         </w:rPr>
-        <w:lastRenderedPageBreak/>
         <w:t>10.3. Yêu cầu đặc biệt</w:t>
       </w:r>
     </w:p>
@@ -21434,6 +21680,7 @@
           <w:color w:val="000000"/>
           <w:szCs w:val="26"/>
         </w:rPr>
+        <w:lastRenderedPageBreak/>
         <w:t>11.2.1. Luồng sự kiện chính</w:t>
       </w:r>
     </w:p>
@@ -21458,7 +21705,6 @@
           <w:color w:val="000000"/>
           <w:szCs w:val="26"/>
         </w:rPr>
-        <w:lastRenderedPageBreak/>
         <w:t>Người tham gia truy cập chức năng “Lượt đăng ký của tôi”.</w:t>
       </w:r>
     </w:p>
@@ -30283,6 +30529,7 @@
                 <w:szCs w:val="26"/>
               </w:rPr>
             </w:pPr>
+            <w:bookmarkStart w:id="2" w:name="_Hlk238215314"/>
             <w:r>
               <w:rPr>
                 <w:rFonts w:eastAsia="Times New Roman" w:cs="Times New Roman"/>
@@ -34144,6 +34391,7 @@
           </w:p>
         </w:tc>
       </w:tr>
+      <w:bookmarkEnd w:id="2"/>
     </w:tbl>
     <w:p/>
     <w:sectPr>

</xml_diff>